<commit_message>
worked on John comments
</commit_message>
<xml_diff>
--- a/reports/thesis/08_chapter_2.docx
+++ b/reports/thesis/08_chapter_2.docx
@@ -4411,16 +4411,7 @@
             <w:sz w:val="22"/>
             <w:szCs w:val="22"/>
           </w:rPr>
-          <m:t xml:space="preserve">(1) </m:t>
-        </m:r>
-        <m:r>
-          <w:rPr>
-            <w:rFonts w:ascii="Cambria Math" w:hAnsi="Cambria Math" w:cs="Arial"/>
-            <w:color w:val="000000" w:themeColor="text1"/>
-            <w:sz w:val="22"/>
-            <w:szCs w:val="22"/>
-          </w:rPr>
-          <m:t xml:space="preserve">daily take=yearly take× </m:t>
+          <m:t xml:space="preserve">(1) daily take=yearly take× </m:t>
         </m:r>
         <m:f>
           <m:fPr>
@@ -4453,25 +4444,7 @@
                 <w:sz w:val="22"/>
                 <w:szCs w:val="22"/>
               </w:rPr>
-              <m:t>sum(</m:t>
-            </m:r>
-            <m:r>
-              <w:rPr>
-                <w:rFonts w:ascii="Cambria Math" w:hAnsi="Cambria Math" w:cs="Arial"/>
-                <w:color w:val="000000" w:themeColor="text1"/>
-                <w:sz w:val="22"/>
-                <w:szCs w:val="22"/>
-              </w:rPr>
-              <m:t>proportion elk</m:t>
-            </m:r>
-            <m:r>
-              <w:rPr>
-                <w:rFonts w:ascii="Cambria Math" w:hAnsi="Cambria Math" w:cs="Arial"/>
-                <w:color w:val="000000" w:themeColor="text1"/>
-                <w:sz w:val="22"/>
-                <w:szCs w:val="22"/>
-              </w:rPr>
-              <m:t>)</m:t>
+              <m:t>sum(proportion elk)</m:t>
             </m:r>
           </m:den>
         </m:f>
@@ -5781,25 +5754,7 @@
               <w:sz w:val="22"/>
               <w:szCs w:val="22"/>
             </w:rPr>
-            <m:t>(</m:t>
-          </m:r>
-          <m:r>
-            <w:rPr>
-              <w:rFonts w:ascii="Cambria Math" w:eastAsiaTheme="minorEastAsia" w:hAnsi="Cambria Math" w:cs="Arial"/>
-              <w:color w:val="000000" w:themeColor="text1"/>
-              <w:sz w:val="22"/>
-              <w:szCs w:val="22"/>
-            </w:rPr>
-            <m:t>2</m:t>
-          </m:r>
-          <m:r>
-            <w:rPr>
-              <w:rFonts w:ascii="Cambria Math" w:eastAsiaTheme="minorEastAsia" w:hAnsi="Cambria Math" w:cs="Arial"/>
-              <w:color w:val="000000" w:themeColor="text1"/>
-              <w:sz w:val="22"/>
-              <w:szCs w:val="22"/>
-            </w:rPr>
-            <m:t>) P(Leave territory) ~ Binomial (</m:t>
+            <m:t>(2) P(Leave territory) ~ Binomial (</m:t>
           </m:r>
           <m:sSub>
             <m:sSubPr>
@@ -6875,25 +6830,7 @@
               <w:sz w:val="22"/>
               <w:szCs w:val="22"/>
             </w:rPr>
-            <m:t>(</m:t>
-          </m:r>
-          <m:r>
-            <w:rPr>
-              <w:rFonts w:ascii="Cambria Math" w:eastAsiaTheme="minorEastAsia" w:hAnsi="Cambria Math" w:cs="Arial"/>
-              <w:color w:val="000000" w:themeColor="text1"/>
-              <w:sz w:val="22"/>
-              <w:szCs w:val="22"/>
-            </w:rPr>
-            <m:t>3</m:t>
-          </m:r>
-          <m:r>
-            <w:rPr>
-              <w:rFonts w:ascii="Cambria Math" w:eastAsiaTheme="minorEastAsia" w:hAnsi="Cambria Math" w:cs="Arial"/>
-              <w:color w:val="000000" w:themeColor="text1"/>
-              <w:sz w:val="22"/>
-              <w:szCs w:val="22"/>
-            </w:rPr>
-            <m:t>) P(Visit hunting region | Leave territory) ~ Binomial (</m:t>
+            <m:t>(3) P(Visit hunting region | Leave territory) ~ Binomial (</m:t>
           </m:r>
           <m:sSub>
             <m:sSubPr>
@@ -12373,16 +12310,7 @@
           <w:sz w:val="22"/>
           <w:szCs w:val="22"/>
         </w:rPr>
-        <w:t xml:space="preserve"> cases, individuals are </w:t>
-      </w:r>
-      <w:r>
-        <w:rPr>
-          <w:rFonts w:ascii="Arial" w:hAnsi="Arial" w:cs="Arial"/>
-          <w:color w:val="000000" w:themeColor="text1"/>
-          <w:sz w:val="22"/>
-          <w:szCs w:val="22"/>
-        </w:rPr>
-        <w:t xml:space="preserve">constantly reassessing foraging quality to decide when </w:t>
+        <w:t xml:space="preserve"> cases, individuals are constantly reassessing foraging quality to decide when </w:t>
       </w:r>
       <w:r>
         <w:rPr>
@@ -12436,6 +12364,58 @@
           <w:sz w:val="22"/>
           <w:szCs w:val="22"/>
         </w:rPr>
+        <w:t xml:space="preserve"> </w:t>
+      </w:r>
+      <w:r>
+        <w:rPr>
+          <w:rFonts w:ascii="Arial" w:hAnsi="Arial" w:cs="Arial"/>
+          <w:color w:val="000000" w:themeColor="text1"/>
+          <w:sz w:val="22"/>
+          <w:szCs w:val="22"/>
+        </w:rPr>
+        <w:fldChar w:fldCharType="begin"/>
+      </w:r>
+      <w:r>
+        <w:rPr>
+          <w:rFonts w:ascii="Arial" w:hAnsi="Arial" w:cs="Arial"/>
+          <w:color w:val="000000" w:themeColor="text1"/>
+          <w:sz w:val="22"/>
+          <w:szCs w:val="22"/>
+        </w:rPr>
+        <w:instrText xml:space="preserve"> ADDIN ZOTERO_ITEM CSL_CITATION {"citationID":"LNAEgSDf","properties":{"unsorted":false,"formattedCitation":"(Amano and Katayama 2009)","plainCitation":"(Amano and Katayama 2009)","noteIndex":0},"citationItems":[{"id":1939,"uris":["http://zotero.org/users/9968163/items/ZTHMQEM5"],"itemData":{"id":1939,"type":"article-journal","abstract":"Animal movements in heterogeneous environments play a crucial role in a variety of ecological processes. Although a hierarchical structure to the scale of movements has been observed in many animal species, few studies to date have revealed what causes such multi-spatial scale movements within the framework of optimal theories. Using detailed information on movement paths and prey captures by Intermediate Egrets in rice fields, this study explored the effects of individual experience at multi-temporal scales on subsequent movement parameters. The results supported three predictions based on optimal foraging theories: (1) movement distances at small and large spatial scales are determined by past foraging experiences over short (one minute) and long (seven to eight minutes) temporal scales, respectively; (2) responses to prey encounters vary between temporal scales, e.g., prey attacks in the previous one minute caused egrets to walk away (i.e., area-avoided search), whereas those in the preceding eight minutes caused egrets to stay around (i.e., area-restricted search); and (3) the probability of patch departure by flying increases with decreasing intake rates in the previous seven minutes, and the quitting intake rate is mostly lower than the long-term average, not including travel time. These results suggest that egrets make different adaptive decisions at different spatial scales: in response to a clumped prey distribution at a large spatial scale, and to a dispersed distribution or behavioral depression of prey at a small spatial scale. This study showed that the framework of optimal foraging theories is useful for comprehensively explaining the different movement modes in animals. It should also be emphasized that considering both area-avoided and restricted searches at multi-temporal scales is important for understanding movement decisions, particularly in organisms searching for hierarchically distributed resources.","container-title":"Ecology","DOI":"10.1890/08-1910.1","ISSN":"1939-9170","issue":"12","language":"en","license":"© 2009 by the Ecological Society of America","note":"_eprint: https://esajournals.onlinelibrary.wiley.com/doi/pdf/10.1890/08-1910.1","page":"3536-3545","source":"Wiley Online Library","title":"Hierarchical movement decisions in predators: effects of foraging experience at more than one spatial and temporal scale","title-short":"Hierarchical movement decisions in predators","volume":"90","author":[{"family":"Amano","given":"Tatsuya"},{"family":"Katayama","given":"Naoki"}],"issued":{"date-parts":[["2009"]]}}}],"schema":"https://github.com/citation-style-language/schema/raw/master/csl-citation.json"} </w:instrText>
+      </w:r>
+      <w:r>
+        <w:rPr>
+          <w:rFonts w:ascii="Arial" w:hAnsi="Arial" w:cs="Arial"/>
+          <w:color w:val="000000" w:themeColor="text1"/>
+          <w:sz w:val="22"/>
+          <w:szCs w:val="22"/>
+        </w:rPr>
+        <w:fldChar w:fldCharType="separate"/>
+      </w:r>
+      <w:r>
+        <w:rPr>
+          <w:rFonts w:ascii="Aptos" w:hAnsi="Aptos"/>
+          <w:sz w:val="22"/>
+        </w:rPr>
+        <w:t>(Amano and Katayama 2009)</w:t>
+      </w:r>
+      <w:r>
+        <w:rPr>
+          <w:rFonts w:ascii="Arial" w:hAnsi="Arial" w:cs="Arial"/>
+          <w:color w:val="000000" w:themeColor="text1"/>
+          <w:sz w:val="22"/>
+          <w:szCs w:val="22"/>
+        </w:rPr>
+        <w:fldChar w:fldCharType="end"/>
+      </w:r>
+      <w:r>
+        <w:rPr>
+          <w:rFonts w:ascii="Arial" w:hAnsi="Arial" w:cs="Arial"/>
+          <w:color w:val="000000" w:themeColor="text1"/>
+          <w:sz w:val="22"/>
+          <w:szCs w:val="22"/>
+        </w:rPr>
         <w:t>.</w:t>
       </w:r>
       <w:r>
@@ -12535,6 +12515,7 @@
           <w:sz w:val="22"/>
           <w:szCs w:val="22"/>
         </w:rPr>
+        <w:lastRenderedPageBreak/>
         <w:t>foraging efficiency</w:t>
       </w:r>
       <w:r>
@@ -12544,17 +12525,7 @@
           <w:sz w:val="22"/>
           <w:szCs w:val="22"/>
         </w:rPr>
-        <w:t xml:space="preserve"> </w:t>
-      </w:r>
-      <w:r>
-        <w:rPr>
-          <w:rFonts w:ascii="Arial" w:hAnsi="Arial" w:cs="Arial"/>
-          <w:color w:val="000000" w:themeColor="text1"/>
-          <w:sz w:val="22"/>
-          <w:szCs w:val="22"/>
-        </w:rPr>
-        <w:lastRenderedPageBreak/>
-        <w:t>according to resource availability</w:t>
+        <w:t xml:space="preserve"> according to resource availability</w:t>
       </w:r>
       <w:r>
         <w:rPr>
@@ -12980,16 +12951,7 @@
           <w:sz w:val="22"/>
           <w:szCs w:val="22"/>
         </w:rPr>
-        <w:t>Territorial ravens remain place-bound throughout the non-breeding season, and</w:t>
-      </w:r>
-      <w:r>
-        <w:rPr>
-          <w:rFonts w:ascii="Arial" w:hAnsi="Arial" w:cs="Arial"/>
-          <w:color w:val="000000" w:themeColor="text1"/>
-          <w:sz w:val="22"/>
-          <w:szCs w:val="22"/>
-        </w:rPr>
-        <w:t xml:space="preserve"> cannot freely track the best foraging locations like more free ranging ungulates </w:t>
+        <w:t xml:space="preserve">Territorial ravens remain place-bound throughout the non-breeding season, and cannot freely track the best foraging locations like more free ranging ungulates </w:t>
       </w:r>
       <w:r>
         <w:rPr>
@@ -13669,6 +13631,149 @@
           <w:sz w:val="22"/>
           <w:szCs w:val="22"/>
         </w:rPr>
+        <w:t>The majority of kills</w:t>
+      </w:r>
+      <w:r>
+        <w:rPr>
+          <w:rFonts w:ascii="Arial" w:hAnsi="Arial" w:cs="Arial"/>
+          <w:color w:val="000000" w:themeColor="text1"/>
+          <w:sz w:val="22"/>
+          <w:szCs w:val="22"/>
+        </w:rPr>
+        <w:t xml:space="preserve"> (6)</w:t>
+      </w:r>
+      <w:r>
+        <w:rPr>
+          <w:rFonts w:ascii="Arial" w:hAnsi="Arial" w:cs="Arial"/>
+          <w:color w:val="000000" w:themeColor="text1"/>
+          <w:sz w:val="22"/>
+          <w:szCs w:val="22"/>
+        </w:rPr>
+        <w:t xml:space="preserve"> that </w:t>
+      </w:r>
+      <w:r>
+        <w:rPr>
+          <w:rFonts w:ascii="Arial" w:hAnsi="Arial" w:cs="Arial"/>
+          <w:color w:val="000000" w:themeColor="text1"/>
+          <w:sz w:val="22"/>
+          <w:szCs w:val="22"/>
+        </w:rPr>
+        <w:t xml:space="preserve">were never </w:t>
+      </w:r>
+      <w:r>
+        <w:rPr>
+          <w:rFonts w:ascii="Arial" w:hAnsi="Arial" w:cs="Arial"/>
+          <w:color w:val="000000" w:themeColor="text1"/>
+          <w:sz w:val="22"/>
+          <w:szCs w:val="22"/>
+        </w:rPr>
+        <w:t>visit</w:t>
+      </w:r>
+      <w:r>
+        <w:rPr>
+          <w:rFonts w:ascii="Arial" w:hAnsi="Arial" w:cs="Arial"/>
+          <w:color w:val="000000" w:themeColor="text1"/>
+          <w:sz w:val="22"/>
+          <w:szCs w:val="22"/>
+        </w:rPr>
+        <w:t>ed</w:t>
+      </w:r>
+      <w:r>
+        <w:rPr>
+          <w:rFonts w:ascii="Arial" w:hAnsi="Arial" w:cs="Arial"/>
+          <w:color w:val="000000" w:themeColor="text1"/>
+          <w:sz w:val="22"/>
+          <w:szCs w:val="22"/>
+        </w:rPr>
+        <w:t xml:space="preserve"> were from one bird (7530) that holds the territory closest to the hunting regions. </w:t>
+      </w:r>
+      <w:r>
+        <w:rPr>
+          <w:rFonts w:ascii="Arial" w:hAnsi="Arial" w:cs="Arial"/>
+          <w:color w:val="000000" w:themeColor="text1"/>
+          <w:sz w:val="22"/>
+          <w:szCs w:val="22"/>
+        </w:rPr>
+        <w:t xml:space="preserve">While we did not find any effect of commuting distance on the probability of leaving the territory, the search cost between wolf kills on her territory and hunter take are equal. The anthropogenic resource then may provide a greater foraging rate by excluding larger, competitively dominant scavengers, such as wolves and coyotes through persecution </w:t>
+      </w:r>
+      <w:r>
+        <w:rPr>
+          <w:rFonts w:ascii="Arial" w:hAnsi="Arial" w:cs="Arial"/>
+          <w:color w:val="000000" w:themeColor="text1"/>
+          <w:sz w:val="22"/>
+          <w:szCs w:val="22"/>
+        </w:rPr>
+        <w:fldChar w:fldCharType="begin"/>
+      </w:r>
+      <w:r>
+        <w:rPr>
+          <w:rFonts w:ascii="Arial" w:hAnsi="Arial" w:cs="Arial"/>
+          <w:color w:val="000000" w:themeColor="text1"/>
+          <w:sz w:val="22"/>
+          <w:szCs w:val="22"/>
+        </w:rPr>
+        <w:instrText xml:space="preserve"> ADDIN ZOTERO_ITEM CSL_CITATION {"citationID":"DWroOeOh","properties":{"unsorted":false,"formattedCitation":"(Wilmers et al. 2003{\\i{}b})","plainCitation":"(Wilmers et al. 2003b)","noteIndex":0},"citationItems":[{"id":74,"uris":["http://zotero.org/users/9968163/items/CP2GY75A"],"itemData":{"id":74,"type":"article-journal","abstract":"The Greater Yellowstone Ecosystem in the northern Rocky Mountains provides the context for a natural experiment to investigate the response of consumers to resources with differing spatial and temporal dispersion regimes. Grey wolves (Canis lupus) and human hunters both provide resource subsidies to scavengers by provisioning them with the remains of their kills. Carrion from hunter kills is highly aggregated in time and space whereas carrion from wolf kills is more dispersed in both time and space. We estimated the total amount of carrion consumed by each scavenger species at both wolf and hunter kills over 4 years. Species with large feeding radii [bald eagles (Haliaeetus leucocephalus) and ravens (Corvus corax)], defined as the area over which a consumer can efficiently locate and integrate resources, dominated consumption at the highly aggregated hunter kills whereas competitively dominant species [coyotes (Canis latrans)] dominated at the more dispersed wolf kills. In addition, species diversity and the evenness of carrion consumption between scavengers was greater at wolf kills than at hunter kills while the total number of scavengers at hunter kills exceeded those at wolf kills. From a community perspective, the top–down effect of predation is likely to be stronger in the vicinity of highly aggregated resource pulses as species with large feeding radii switch to feeding on alternative prey once the resource pulse subsides.","container-title":"Ecology Letters","DOI":"10.1046/j.1461-0248.2003.00522.x","ISSN":"1461-0248","issue":"11","language":"en","note":"_eprint: https://onlinelibrary.wiley.com/doi/pdf/10.1046/j.1461-0248.2003.00522.x","page":"996-1003","source":"Wiley Online Library","title":"Resource dispersion and consumer dominance: scavenging at wolf- and hunter-killed carcasses in Greater Yellowstone, USA","title-short":"Resource dispersion and consumer dominance","volume":"6","author":[{"family":"Wilmers","given":"Christopher C."},{"family":"Stahler","given":"Daniel R."},{"family":"Crabtree","given":"Robert L."},{"family":"Smith","given":"Douglas W."},{"family":"Getz","given":"Wayne M."}],"issued":{"date-parts":[["2003"]]}}}],"schema":"https://github.com/citation-style-language/schema/raw/master/csl-citation.json"} </w:instrText>
+      </w:r>
+      <w:r>
+        <w:rPr>
+          <w:rFonts w:ascii="Arial" w:hAnsi="Arial" w:cs="Arial"/>
+          <w:color w:val="000000" w:themeColor="text1"/>
+          <w:sz w:val="22"/>
+          <w:szCs w:val="22"/>
+        </w:rPr>
+        <w:fldChar w:fldCharType="separate"/>
+      </w:r>
+      <w:r>
+        <w:rPr>
+          <w:rFonts w:ascii="Aptos" w:hAnsi="Aptos" w:cs="Times New Roman"/>
+          <w:kern w:val="0"/>
+          <w:sz w:val="22"/>
+        </w:rPr>
+        <w:t>(Wilmers et al. 2003</w:t>
+      </w:r>
+      <w:r>
+        <w:rPr>
+          <w:rFonts w:ascii="Aptos" w:hAnsi="Aptos" w:cs="Times New Roman"/>
+          <w:i/>
+          <w:iCs/>
+          <w:kern w:val="0"/>
+          <w:sz w:val="22"/>
+        </w:rPr>
+        <w:t>b</w:t>
+      </w:r>
+      <w:r>
+        <w:rPr>
+          <w:rFonts w:ascii="Aptos" w:hAnsi="Aptos" w:cs="Times New Roman"/>
+          <w:kern w:val="0"/>
+          <w:sz w:val="22"/>
+        </w:rPr>
+        <w:t>)</w:t>
+      </w:r>
+      <w:r>
+        <w:rPr>
+          <w:rFonts w:ascii="Arial" w:hAnsi="Arial" w:cs="Arial"/>
+          <w:color w:val="000000" w:themeColor="text1"/>
+          <w:sz w:val="22"/>
+          <w:szCs w:val="22"/>
+        </w:rPr>
+        <w:fldChar w:fldCharType="end"/>
+      </w:r>
+      <w:r>
+        <w:rPr>
+          <w:rFonts w:ascii="Arial" w:hAnsi="Arial" w:cs="Arial"/>
+          <w:color w:val="000000" w:themeColor="text1"/>
+          <w:sz w:val="22"/>
+          <w:szCs w:val="22"/>
+        </w:rPr>
+        <w:t xml:space="preserve">. </w:t>
+      </w:r>
+      <w:r>
+        <w:rPr>
+          <w:rFonts w:ascii="Arial" w:hAnsi="Arial" w:cs="Arial"/>
+          <w:color w:val="000000" w:themeColor="text1"/>
+          <w:sz w:val="22"/>
+          <w:szCs w:val="22"/>
+        </w:rPr>
         <w:t xml:space="preserve">Wolf kills </w:t>
       </w:r>
       <w:r>
@@ -13723,16 +13828,34 @@
           <w:sz w:val="22"/>
           <w:szCs w:val="22"/>
         </w:rPr>
-        <w:t xml:space="preserve"> days of the kill being made, and visits to kills became more intermittent as time progressed. At 6 of the 10 carcasses visited, providing evidence that the raven knew about the resources, they </w:t>
-      </w:r>
-      <w:r>
-        <w:rPr>
-          <w:rFonts w:ascii="Arial" w:hAnsi="Arial" w:cs="Arial"/>
-          <w:color w:val="000000" w:themeColor="text1"/>
-          <w:sz w:val="22"/>
-          <w:szCs w:val="22"/>
-        </w:rPr>
-        <w:t>exit</w:t>
+        <w:t xml:space="preserve"> days of the kill being made, and visits to kills became more intermittent as time progressed. At 6 of the 10 carcasses visited, providing evidence that the raven knew about the resources, </w:t>
+      </w:r>
+      <w:r>
+        <w:rPr>
+          <w:rFonts w:ascii="Arial" w:hAnsi="Arial" w:cs="Arial"/>
+          <w:color w:val="000000" w:themeColor="text1"/>
+          <w:sz w:val="22"/>
+          <w:szCs w:val="22"/>
+        </w:rPr>
+        <w:t>ravens</w:t>
+      </w:r>
+      <w:r>
+        <w:rPr>
+          <w:rFonts w:ascii="Arial" w:hAnsi="Arial" w:cs="Arial"/>
+          <w:color w:val="000000" w:themeColor="text1"/>
+          <w:sz w:val="22"/>
+          <w:szCs w:val="22"/>
+        </w:rPr>
+        <w:t xml:space="preserve"> </w:t>
+      </w:r>
+      <w:r>
+        <w:rPr>
+          <w:rFonts w:ascii="Arial" w:hAnsi="Arial" w:cs="Arial"/>
+          <w:color w:val="000000" w:themeColor="text1"/>
+          <w:sz w:val="22"/>
+          <w:szCs w:val="22"/>
+        </w:rPr>
+        <w:t>left</w:t>
       </w:r>
       <w:r>
         <w:rPr>
@@ -13894,16 +14017,7 @@
           <w:sz w:val="22"/>
           <w:szCs w:val="22"/>
         </w:rPr>
-        <w:t>. The biomass acquired from an older wolf kill where competition from conspecifics is still high may be less than what could be obtained in another location. While the presence of wolf kills was still impactful, the picture is much more complex than we were able to capture and likely involves many other factors that can affect a raven’s foraging efficiency such as the carcass size, number of wolves and competing scavengers, biomass remaining, and other non-foraging related behaviors.</w:t>
-      </w:r>
-      <w:r>
-        <w:rPr>
-          <w:rFonts w:ascii="Arial" w:hAnsi="Arial" w:cs="Arial"/>
-          <w:color w:val="000000" w:themeColor="text1"/>
-          <w:sz w:val="22"/>
-          <w:szCs w:val="22"/>
-        </w:rPr>
-        <w:t xml:space="preserve"> </w:t>
+        <w:t xml:space="preserve">. The biomass acquired from an older wolf kill where competition from conspecifics is still high may be less than what could be obtained in another location. While the presence of wolf kills was still impactful, the picture is much more complex than we were able to capture and likely involves many other factors that can affect a raven’s foraging efficiency such as the carcass size, number of wolves and competing scavengers, biomass remaining, and other non-foraging related behaviors. </w:t>
       </w:r>
     </w:p>
     <w:p>
@@ -13994,7 +14108,17 @@
           <w:sz w:val="22"/>
           <w:szCs w:val="22"/>
         </w:rPr>
-        <w:t xml:space="preserve">OPT is generally considered for a single organism, but has been expanded to consider competition and information sharing between foragers for resources into a game-theory style problem for social foraging </w:t>
+        <w:t xml:space="preserve">OPT is generally considered for a single organism, but has been expanded to consider competition and information sharing between foragers for resources into a game-theory style </w:t>
+      </w:r>
+      <w:r>
+        <w:rPr>
+          <w:rFonts w:ascii="Arial" w:hAnsi="Arial" w:cs="Arial"/>
+          <w:color w:val="000000" w:themeColor="text1"/>
+          <w:sz w:val="22"/>
+          <w:szCs w:val="22"/>
+        </w:rPr>
+        <w:lastRenderedPageBreak/>
+        <w:t xml:space="preserve">problem for social foraging </w:t>
       </w:r>
       <w:r>
         <w:rPr>
@@ -14386,17 +14510,7 @@
           <w:sz w:val="22"/>
           <w:szCs w:val="22"/>
         </w:rPr>
-        <w:t xml:space="preserve"> such as the relatively </w:t>
-      </w:r>
-      <w:r>
-        <w:rPr>
-          <w:rFonts w:ascii="Arial" w:hAnsi="Arial" w:cs="Arial"/>
-          <w:color w:val="000000" w:themeColor="text1"/>
-          <w:sz w:val="22"/>
-          <w:szCs w:val="22"/>
-        </w:rPr>
-        <w:lastRenderedPageBreak/>
-        <w:t>consistent bounds of the MTFWP hunting season</w:t>
+        <w:t xml:space="preserve"> such as the relatively consistent bounds of the MTFWP hunting season</w:t>
       </w:r>
       <w:r>
         <w:rPr>
@@ -15304,7 +15418,17 @@
           <w:sz w:val="22"/>
           <w:szCs w:val="22"/>
         </w:rPr>
-        <w:t>, which create more competition for resources than 7493_2 likely faces</w:t>
+        <w:t xml:space="preserve">, which create more competition for resources than 7493_2 likely </w:t>
+      </w:r>
+      <w:r>
+        <w:rPr>
+          <w:rFonts w:ascii="Arial" w:hAnsi="Arial" w:cs="Arial"/>
+          <w:color w:val="000000" w:themeColor="text1"/>
+          <w:sz w:val="22"/>
+          <w:szCs w:val="22"/>
+        </w:rPr>
+        <w:lastRenderedPageBreak/>
+        <w:t>faces</w:t>
       </w:r>
       <w:r>
         <w:rPr>
@@ -15647,17 +15771,7 @@
           <w:sz w:val="22"/>
           <w:szCs w:val="22"/>
         </w:rPr>
-        <w:t xml:space="preserve">. Carrion </w:t>
-      </w:r>
-      <w:r>
-        <w:rPr>
-          <w:rFonts w:ascii="Arial" w:hAnsi="Arial" w:cs="Arial"/>
-          <w:color w:val="000000" w:themeColor="text1"/>
-          <w:sz w:val="22"/>
-          <w:szCs w:val="22"/>
-        </w:rPr>
-        <w:lastRenderedPageBreak/>
-        <w:t xml:space="preserve">may be preferred by ravens when both are equally available, but the commute time for ravens farthest from recreational hunting may be more than a third of daylight hours, during which they cannot perform any other critical behaviors. This leads to an optimization decision where individuals choose the less-preferred resource with the lower travel cost. For territories equidistant from multiple anthropogenic resources (purple dots in Fig. </w:t>
+        <w:t xml:space="preserve">. Carrion may be preferred by ravens when both are equally available, but the commute time for ravens farthest from recreational hunting may be more than a third of daylight hours, during which they cannot perform any other critical behaviors. This leads to an optimization decision where individuals choose the less-preferred resource with the lower travel cost. For territories equidistant from multiple anthropogenic resources (purple dots in Fig. </w:t>
       </w:r>
       <w:r>
         <w:rPr>
@@ -15909,7 +16023,17 @@
           <w:sz w:val="22"/>
           <w:szCs w:val="22"/>
         </w:rPr>
-        <w:t xml:space="preserve">. While wolf density, and therefore kill availability, are relatively dense in Yellowstone compared to other ecosystems, very few ravens had wolf kills available to them within their territories. Only 6 individuals visited kills available to them, resulting in large uncertainty in the model. The GPS data loggers presented another limitation. The fix-rate likely missed visits to wolf kills, especially if the individual did not spend extended periods of time interacting with the resource. This results in a slightly messy interpretation of the wolf kill availability covariate, where it is not clear on which days a raven has knowledge that a wolf kill is within its territory if a GPS point is never recorded at the site. Despite this, when ravens visit a wolf kill, indicating knowledge of the site, there was a clear negative effect. </w:t>
+        <w:t xml:space="preserve">. While wolf density, and therefore kill availability, are relatively dense in Yellowstone compared to other ecosystems, very few ravens had wolf kills available to them within their territories. Only 6 individuals visited kills available to them, resulting in large uncertainty in the model. The GPS data loggers presented another limitation. The fix-rate likely missed visits to wolf kills, especially if the individual did not spend extended periods of time interacting with the resource. This results in a slightly messy </w:t>
+      </w:r>
+      <w:r>
+        <w:rPr>
+          <w:rFonts w:ascii="Arial" w:hAnsi="Arial" w:cs="Arial"/>
+          <w:color w:val="000000" w:themeColor="text1"/>
+          <w:sz w:val="22"/>
+          <w:szCs w:val="22"/>
+        </w:rPr>
+        <w:lastRenderedPageBreak/>
+        <w:t xml:space="preserve">interpretation of the wolf kill availability covariate, where it is not clear on which days a raven has knowledge that a wolf kill is within its territory if a GPS point is never recorded at the site. Despite this, when ravens visit a wolf kill, indicating knowledge of the site, there was a clear negative effect. </w:t>
       </w:r>
     </w:p>
     <w:p>
@@ -16047,17 +16171,7 @@
           <w:sz w:val="22"/>
           <w:szCs w:val="22"/>
         </w:rPr>
-        <w:t xml:space="preserve">, </w:t>
-      </w:r>
-      <w:r>
-        <w:rPr>
-          <w:rFonts w:ascii="Arial" w:hAnsi="Arial" w:cs="Arial"/>
-          <w:color w:val="000000" w:themeColor="text1"/>
-          <w:sz w:val="22"/>
-          <w:szCs w:val="22"/>
-        </w:rPr>
-        <w:lastRenderedPageBreak/>
-        <w:t>shifting foraging opportunities for ravens during the winter</w:t>
+        <w:t>, shifting foraging opportunities for ravens during the winter</w:t>
       </w:r>
       <w:r>
         <w:rPr>
@@ -17155,7 +17269,7 @@
         <w:annotationRef/>
       </w:r>
       <w:r>
-        <w:t>Only could match the predictive model kills to 10 kills detected by wolf project. They were all large (1 bison, 7 adult elk, 1 elk calf)</w:t>
+        <w:t>Only could match the predictive model kills to 10 kills detected by wolf project. They were all large (1 bison, 7 adult elk, 2 elk calf)</w:t>
       </w:r>
     </w:p>
   </w:comment>
@@ -17927,6 +18041,7 @@
   <w:style w:type="character" w:default="1" w:styleId="DefaultParagraphFont">
     <w:name w:val="Default Paragraph Font"/>
     <w:uiPriority w:val="1"/>
+    <w:semiHidden/>
     <w:unhideWhenUsed/>
   </w:style>
   <w:style w:type="table" w:default="1" w:styleId="TableNormal">

</xml_diff>

<commit_message>
added wolf kill map
</commit_message>
<xml_diff>
--- a/reports/thesis/08_chapter_2.docx
+++ b/reports/thesis/08_chapter_2.docx
@@ -4047,7 +4047,70 @@
           <w:sz w:val="22"/>
           <w:szCs w:val="22"/>
         </w:rPr>
-        <w:t xml:space="preserve"> that predicts carrion locations from wolf movements, timing, and landscape features. The model makes no determinations about the prey species or cause of death and functions optimally during the winter study periods performed by the Wolf, Cougar, and Elk Project (November 15 – December 15, March 1 – 30; hereafter early and late winter, respectively). We removed wolf-kill sites identified by the predictive model that were within a hunting region during the hunting season, as ravens would already be classified as visiting the hunting region. Each wolf kill remained </w:t>
+        <w:t xml:space="preserve"> that predicts carrion locations from wolf movements, timing, and landscape features</w:t>
+      </w:r>
+      <w:r>
+        <w:rPr>
+          <w:rFonts w:ascii="Arial" w:hAnsi="Arial" w:cs="Arial"/>
+          <w:color w:val="000000" w:themeColor="text1"/>
+          <w:sz w:val="22"/>
+          <w:szCs w:val="22"/>
+        </w:rPr>
+        <w:t xml:space="preserve"> (Appendix A, S</w:t>
+      </w:r>
+      <w:r>
+        <w:rPr>
+          <w:rFonts w:ascii="Arial" w:hAnsi="Arial" w:cs="Arial"/>
+          <w:color w:val="000000" w:themeColor="text1"/>
+          <w:sz w:val="22"/>
+          <w:szCs w:val="22"/>
+        </w:rPr>
+        <w:t xml:space="preserve">upp. </w:t>
+      </w:r>
+      <w:r>
+        <w:rPr>
+          <w:rFonts w:ascii="Arial" w:hAnsi="Arial" w:cs="Arial"/>
+          <w:color w:val="000000" w:themeColor="text1"/>
+          <w:sz w:val="22"/>
+          <w:szCs w:val="22"/>
+        </w:rPr>
+        <w:t>Fig</w:t>
+      </w:r>
+      <w:r>
+        <w:rPr>
+          <w:rFonts w:ascii="Arial" w:hAnsi="Arial" w:cs="Arial"/>
+          <w:color w:val="000000" w:themeColor="text1"/>
+          <w:sz w:val="22"/>
+          <w:szCs w:val="22"/>
+        </w:rPr>
+        <w:t>.</w:t>
+      </w:r>
+      <w:r>
+        <w:rPr>
+          <w:rFonts w:ascii="Arial" w:hAnsi="Arial" w:cs="Arial"/>
+          <w:color w:val="000000" w:themeColor="text1"/>
+          <w:sz w:val="22"/>
+          <w:szCs w:val="22"/>
+        </w:rPr>
+        <w:t xml:space="preserve"> 1)</w:t>
+      </w:r>
+      <w:r>
+        <w:rPr>
+          <w:rFonts w:ascii="Arial" w:hAnsi="Arial" w:cs="Arial"/>
+          <w:color w:val="000000" w:themeColor="text1"/>
+          <w:sz w:val="22"/>
+          <w:szCs w:val="22"/>
+        </w:rPr>
+        <w:t>.</w:t>
+      </w:r>
+      <w:r>
+        <w:rPr>
+          <w:rFonts w:ascii="Arial" w:hAnsi="Arial" w:cs="Arial"/>
+          <w:color w:val="000000" w:themeColor="text1"/>
+          <w:sz w:val="22"/>
+          <w:szCs w:val="22"/>
+        </w:rPr>
+        <w:t xml:space="preserve"> The model makes no determinations about the prey species or cause of death and functions optimally during the winter study periods performed by the Wolf, Cougar, and Elk Project (November 15 – December 15, March 1 – 30; hereafter early and late winter, respectively). We removed wolf-kill sites identified by the predictive model that were within a hunting region during the hunting season, as ravens would already be classified as visiting the hunting region. Each wolf kill remained </w:t>
       </w:r>
       <w:r>
         <w:rPr>
@@ -4095,7 +4158,7 @@
           <w:sz w:val="22"/>
           <w:szCs w:val="22"/>
         </w:rPr>
-        <w:t xml:space="preserve">after the last wolf GPS point as direct observations of wolf kills had ravens returning to the site for an average 1.2 days (unpublished data). This additional day accounts for the continued availability and use of the carcass after wolves have abandoned it. </w:t>
+        <w:t xml:space="preserve">after the last wolf GPS point as direct observations of wolf kills had ravens returning to the site for an average 1.2 days (unpublished data). This additional day accounts for the continued availability and use of the carcass after </w:t>
       </w:r>
       <w:r>
         <w:rPr>
@@ -4105,6 +4168,15 @@
           <w:szCs w:val="22"/>
         </w:rPr>
         <w:lastRenderedPageBreak/>
+        <w:t xml:space="preserve">wolves have abandoned it. </w:t>
+      </w:r>
+      <w:r>
+        <w:rPr>
+          <w:rFonts w:ascii="Arial" w:hAnsi="Arial" w:cs="Arial"/>
+          <w:color w:val="000000" w:themeColor="text1"/>
+          <w:sz w:val="22"/>
+          <w:szCs w:val="22"/>
+        </w:rPr>
         <w:t>We considered</w:t>
       </w:r>
       <w:r>

</xml_diff>

<commit_message>
edit Beth comments on methods
</commit_message>
<xml_diff>
--- a/reports/thesis/08_chapter_2.docx
+++ b/reports/thesis/08_chapter_2.docx
@@ -4681,34 +4681,7 @@
           <w:sz w:val="22"/>
           <w:szCs w:val="22"/>
         </w:rPr>
-        <w:t xml:space="preserve"> ≥</w:t>
-      </w:r>
-      <w:r>
-        <w:rPr>
-          <w:rFonts w:ascii="Arial" w:hAnsi="Arial" w:cs="Arial"/>
-          <w:color w:val="000000" w:themeColor="text1"/>
-          <w:sz w:val="22"/>
-          <w:szCs w:val="22"/>
-        </w:rPr>
-        <w:t>1 GPS point</w:t>
-      </w:r>
-      <w:r>
-        <w:rPr>
-          <w:rFonts w:ascii="Arial" w:hAnsi="Arial" w:cs="Arial"/>
-          <w:color w:val="000000" w:themeColor="text1"/>
-          <w:sz w:val="22"/>
-          <w:szCs w:val="22"/>
-        </w:rPr>
-        <w:t>s</w:t>
-      </w:r>
-      <w:r>
-        <w:rPr>
-          <w:rFonts w:ascii="Arial" w:hAnsi="Arial" w:cs="Arial"/>
-          <w:color w:val="000000" w:themeColor="text1"/>
-          <w:sz w:val="22"/>
-          <w:szCs w:val="22"/>
-        </w:rPr>
-        <w:t xml:space="preserve"> within 500 </w:t>
+        <w:t xml:space="preserve"> ≥1 GPS points within 500 </w:t>
       </w:r>
       <w:r>
         <w:rPr>
@@ -6090,16 +6063,7 @@
           <w:sz w:val="22"/>
           <w:szCs w:val="22"/>
         </w:rPr>
-        <w:t xml:space="preserve"> </w:t>
-      </w:r>
-      <w:r>
-        <w:rPr>
-          <w:rFonts w:ascii="Arial" w:hAnsi="Arial" w:cs="Arial"/>
-          <w:color w:val="000000" w:themeColor="text1"/>
-          <w:sz w:val="22"/>
-          <w:szCs w:val="22"/>
-        </w:rPr>
-        <w:t>(National Center for Environmental Information)</w:t>
+        <w:t xml:space="preserve"> (National Center for Environmental Information)</w:t>
       </w:r>
       <w:r>
         <w:rPr>
@@ -7841,7 +7805,10 @@
           <m:e>
             <m:r>
               <w:rPr>
-                <w:rFonts w:ascii="Cambria Math" w:hAnsi="Cambria Math"/>
+                <w:rFonts w:ascii="Cambria Math" w:hAnsi="Cambria Math" w:cs="Arial"/>
+                <w:color w:val="000000" w:themeColor="text1"/>
+                <w:sz w:val="22"/>
+                <w:szCs w:val="22"/>
               </w:rPr>
               <m:t>ϕ</m:t>
             </m:r>
@@ -9317,6 +9284,7 @@
     </w:p>
     <w:p>
       <w:pPr>
+        <w:pStyle w:val="Heading2"/>
         <w:spacing w:line="480" w:lineRule="auto"/>
         <w:rPr>
           <w:rFonts w:ascii="Arial" w:hAnsi="Arial" w:cs="Arial"/>
@@ -10309,25 +10277,7 @@
           <w:sz w:val="22"/>
           <w:szCs w:val="22"/>
         </w:rPr>
-        <w:t xml:space="preserve"> is </w:t>
-      </w:r>
-      <w:r>
-        <w:rPr>
-          <w:rFonts w:ascii="Arial" w:hAnsi="Arial" w:cs="Arial"/>
-          <w:color w:val="000000" w:themeColor="text1"/>
-          <w:sz w:val="22"/>
-          <w:szCs w:val="22"/>
-        </w:rPr>
-        <w:t>when</w:t>
-      </w:r>
-      <w:r>
-        <w:rPr>
-          <w:rFonts w:ascii="Arial" w:hAnsi="Arial" w:cs="Arial"/>
-          <w:color w:val="000000" w:themeColor="text1"/>
-          <w:sz w:val="22"/>
-          <w:szCs w:val="22"/>
-        </w:rPr>
-        <w:t xml:space="preserve"> a raven visits the hunting regions.</w:t>
+        <w:t xml:space="preserve"> is when a raven visits the hunting regions.</w:t>
       </w:r>
       <w:r>
         <w:rPr>
@@ -12644,16 +12594,7 @@
           <w:sz w:val="22"/>
           <w:szCs w:val="22"/>
         </w:rPr>
-        <w:t xml:space="preserve"> (</w:t>
-      </w:r>
-      <w:r>
-        <w:rPr>
-          <w:rFonts w:ascii="Arial" w:hAnsi="Arial" w:cs="Arial"/>
-          <w:color w:val="000000" w:themeColor="text1"/>
-          <w:sz w:val="22"/>
-          <w:szCs w:val="22"/>
-        </w:rPr>
-        <w:t xml:space="preserve">Fig. 6; Appendix D, Supp. Table </w:t>
+        <w:t xml:space="preserve"> (Fig. 6; Appendix D, Supp. Table </w:t>
       </w:r>
       <w:commentRangeStart w:id="9"/>
       <w:r>
@@ -13408,6 +13349,267 @@
           <w:sz w:val="22"/>
           <w:szCs w:val="22"/>
         </w:rPr>
+        <w:t xml:space="preserve"> (Fig. 8; Appendix D, Supp. Table 4)</w:t>
+      </w:r>
+      <w:r>
+        <w:rPr>
+          <w:rFonts w:ascii="Arial" w:hAnsi="Arial" w:cs="Arial"/>
+          <w:color w:val="000000" w:themeColor="text1"/>
+          <w:sz w:val="22"/>
+          <w:szCs w:val="22"/>
+        </w:rPr>
+        <w:t xml:space="preserve">. </w:t>
+      </w:r>
+      <w:r>
+        <w:rPr>
+          <w:rFonts w:ascii="Arial" w:hAnsi="Arial" w:cs="Arial"/>
+          <w:color w:val="000000" w:themeColor="text1"/>
+          <w:sz w:val="22"/>
+          <w:szCs w:val="22"/>
+        </w:rPr>
+        <w:t>A r</w:t>
+      </w:r>
+      <w:r>
+        <w:rPr>
+          <w:rFonts w:ascii="Arial" w:hAnsi="Arial" w:cs="Arial"/>
+          <w:color w:val="000000" w:themeColor="text1"/>
+          <w:sz w:val="22"/>
+          <w:szCs w:val="22"/>
+        </w:rPr>
+        <w:t>aven</w:t>
+      </w:r>
+      <w:r>
+        <w:rPr>
+          <w:rFonts w:ascii="Arial" w:hAnsi="Arial" w:cs="Arial"/>
+          <w:color w:val="000000" w:themeColor="text1"/>
+          <w:sz w:val="22"/>
+          <w:szCs w:val="22"/>
+        </w:rPr>
+        <w:t>’</w:t>
+      </w:r>
+      <w:r>
+        <w:rPr>
+          <w:rFonts w:ascii="Arial" w:hAnsi="Arial" w:cs="Arial"/>
+          <w:color w:val="000000" w:themeColor="text1"/>
+          <w:sz w:val="22"/>
+          <w:szCs w:val="22"/>
+        </w:rPr>
+        <w:t xml:space="preserve">s </w:t>
+      </w:r>
+      <w:r>
+        <w:rPr>
+          <w:rFonts w:ascii="Arial" w:hAnsi="Arial" w:cs="Arial"/>
+          <w:color w:val="000000" w:themeColor="text1"/>
+          <w:sz w:val="22"/>
+          <w:szCs w:val="22"/>
+        </w:rPr>
+        <w:t>probability of visiting</w:t>
+      </w:r>
+      <w:r>
+        <w:rPr>
+          <w:rFonts w:ascii="Arial" w:hAnsi="Arial" w:cs="Arial"/>
+          <w:color w:val="000000" w:themeColor="text1"/>
+          <w:sz w:val="22"/>
+          <w:szCs w:val="22"/>
+        </w:rPr>
+        <w:t xml:space="preserve"> the hunting regions </w:t>
+      </w:r>
+      <w:r>
+        <w:rPr>
+          <w:rFonts w:ascii="Arial" w:hAnsi="Arial" w:cs="Arial"/>
+          <w:color w:val="000000" w:themeColor="text1"/>
+          <w:sz w:val="22"/>
+          <w:szCs w:val="22"/>
+        </w:rPr>
+        <w:t>increased</w:t>
+      </w:r>
+      <w:r>
+        <w:rPr>
+          <w:rFonts w:ascii="Arial" w:hAnsi="Arial" w:cs="Arial"/>
+          <w:color w:val="000000" w:themeColor="text1"/>
+          <w:sz w:val="22"/>
+          <w:szCs w:val="22"/>
+        </w:rPr>
+        <w:t xml:space="preserve"> by 0.27 (0.23, 0.30) </w:t>
+      </w:r>
+      <w:r>
+        <w:rPr>
+          <w:rFonts w:ascii="Arial" w:hAnsi="Arial" w:cs="Arial"/>
+          <w:color w:val="000000" w:themeColor="text1"/>
+          <w:sz w:val="22"/>
+          <w:szCs w:val="22"/>
+        </w:rPr>
+        <w:t>during the hunting season (</w:t>
+      </w:r>
+      <w:r>
+        <w:rPr>
+          <w:rFonts w:ascii="Arial" w:hAnsi="Arial" w:cs="Arial"/>
+          <w:color w:val="000000" w:themeColor="text1"/>
+          <w:sz w:val="22"/>
+          <w:szCs w:val="22"/>
+        </w:rPr>
+        <w:t xml:space="preserve">OR = </w:t>
+      </w:r>
+      <w:r>
+        <w:rPr>
+          <w:rFonts w:ascii="Arial" w:hAnsi="Arial" w:cs="Arial"/>
+          <w:color w:val="000000" w:themeColor="text1"/>
+          <w:sz w:val="22"/>
+          <w:szCs w:val="22"/>
+        </w:rPr>
+        <w:t>3.4</w:t>
+      </w:r>
+      <w:r>
+        <w:rPr>
+          <w:rFonts w:ascii="Arial" w:hAnsi="Arial" w:cs="Arial"/>
+          <w:color w:val="000000" w:themeColor="text1"/>
+          <w:sz w:val="22"/>
+          <w:szCs w:val="22"/>
+        </w:rPr>
+        <w:t xml:space="preserve"> </w:t>
+      </w:r>
+      <w:r>
+        <w:rPr>
+          <w:rFonts w:ascii="Arial" w:hAnsi="Arial" w:cs="Arial"/>
+          <w:color w:val="000000" w:themeColor="text1"/>
+          <w:sz w:val="22"/>
+          <w:szCs w:val="22"/>
+        </w:rPr>
+        <w:t>[</w:t>
+      </w:r>
+      <w:r>
+        <w:rPr>
+          <w:rFonts w:ascii="Arial" w:hAnsi="Arial" w:cs="Arial"/>
+          <w:color w:val="000000" w:themeColor="text1"/>
+          <w:sz w:val="22"/>
+          <w:szCs w:val="22"/>
+        </w:rPr>
+        <w:t>2.34, 4.95</w:t>
+      </w:r>
+      <w:r>
+        <w:rPr>
+          <w:rFonts w:ascii="Arial" w:hAnsi="Arial" w:cs="Arial"/>
+          <w:color w:val="000000" w:themeColor="text1"/>
+          <w:sz w:val="22"/>
+          <w:szCs w:val="22"/>
+        </w:rPr>
+        <w:t>]</w:t>
+      </w:r>
+      <w:r>
+        <w:rPr>
+          <w:rFonts w:ascii="Arial" w:hAnsi="Arial" w:cs="Arial"/>
+          <w:color w:val="000000" w:themeColor="text1"/>
+          <w:sz w:val="22"/>
+          <w:szCs w:val="22"/>
+        </w:rPr>
+        <w:t>, Fig. 9</w:t>
+      </w:r>
+      <w:r>
+        <w:rPr>
+          <w:rFonts w:ascii="Arial" w:hAnsi="Arial" w:cs="Arial"/>
+          <w:color w:val="000000" w:themeColor="text1"/>
+          <w:sz w:val="22"/>
+          <w:szCs w:val="22"/>
+        </w:rPr>
+        <w:t>) but</w:t>
+      </w:r>
+      <w:r>
+        <w:rPr>
+          <w:rFonts w:ascii="Arial" w:hAnsi="Arial" w:cs="Arial"/>
+          <w:color w:val="000000" w:themeColor="text1"/>
+          <w:sz w:val="22"/>
+          <w:szCs w:val="22"/>
+        </w:rPr>
+        <w:t xml:space="preserve"> were not influenced by the actual amount of biomass available in hunting areas (</w:t>
+      </w:r>
+      <w:r>
+        <w:rPr>
+          <w:rFonts w:ascii="Arial" w:hAnsi="Arial" w:cs="Arial"/>
+          <w:color w:val="000000" w:themeColor="text1"/>
+          <w:sz w:val="22"/>
+          <w:szCs w:val="22"/>
+        </w:rPr>
+        <w:t>p = 0.</w:t>
+      </w:r>
+      <w:r>
+        <w:rPr>
+          <w:rFonts w:ascii="Arial" w:hAnsi="Arial" w:cs="Arial"/>
+          <w:color w:val="000000" w:themeColor="text1"/>
+          <w:sz w:val="22"/>
+          <w:szCs w:val="22"/>
+        </w:rPr>
+        <w:t>13</w:t>
+      </w:r>
+      <w:r>
+        <w:rPr>
+          <w:rFonts w:ascii="Arial" w:hAnsi="Arial" w:cs="Arial"/>
+          <w:color w:val="000000" w:themeColor="text1"/>
+          <w:sz w:val="22"/>
+          <w:szCs w:val="22"/>
+        </w:rPr>
+        <w:t xml:space="preserve">). </w:t>
+      </w:r>
+      <w:r>
+        <w:rPr>
+          <w:rFonts w:ascii="Arial" w:hAnsi="Arial" w:cs="Arial"/>
+          <w:color w:val="000000" w:themeColor="text1"/>
+          <w:sz w:val="22"/>
+          <w:szCs w:val="22"/>
+        </w:rPr>
+        <w:t xml:space="preserve">Ravens </w:t>
+      </w:r>
+      <w:r>
+        <w:rPr>
+          <w:rFonts w:ascii="Arial" w:hAnsi="Arial" w:cs="Arial"/>
+          <w:color w:val="000000" w:themeColor="text1"/>
+          <w:sz w:val="22"/>
+          <w:szCs w:val="22"/>
+        </w:rPr>
+        <w:t xml:space="preserve">reduced the </w:t>
+      </w:r>
+      <w:r>
+        <w:rPr>
+          <w:rFonts w:ascii="Arial" w:hAnsi="Arial" w:cs="Arial"/>
+          <w:color w:val="000000" w:themeColor="text1"/>
+          <w:sz w:val="22"/>
+          <w:szCs w:val="22"/>
+        </w:rPr>
+        <w:t>probability</w:t>
+      </w:r>
+      <w:r>
+        <w:rPr>
+          <w:rFonts w:ascii="Arial" w:hAnsi="Arial" w:cs="Arial"/>
+          <w:color w:val="000000" w:themeColor="text1"/>
+          <w:sz w:val="22"/>
+          <w:szCs w:val="22"/>
+        </w:rPr>
+        <w:t xml:space="preserve"> of visiting the hunting area</w:t>
+      </w:r>
+      <w:r>
+        <w:rPr>
+          <w:rFonts w:ascii="Arial" w:hAnsi="Arial" w:cs="Arial"/>
+          <w:color w:val="000000" w:themeColor="text1"/>
+          <w:sz w:val="22"/>
+          <w:szCs w:val="22"/>
+        </w:rPr>
+        <w:t xml:space="preserve"> by </w:t>
+      </w:r>
+      <w:r>
+        <w:rPr>
+          <w:rFonts w:ascii="Arial" w:hAnsi="Arial" w:cs="Arial"/>
+          <w:color w:val="000000" w:themeColor="text1"/>
+          <w:sz w:val="22"/>
+          <w:szCs w:val="22"/>
+        </w:rPr>
+        <w:t>0.24</w:t>
+      </w:r>
+      <w:r>
+        <w:rPr>
+          <w:rFonts w:ascii="Arial" w:hAnsi="Arial" w:cs="Arial"/>
+          <w:color w:val="000000" w:themeColor="text1"/>
+          <w:sz w:val="22"/>
+          <w:szCs w:val="22"/>
+        </w:rPr>
         <w:t xml:space="preserve"> (</w:t>
       </w:r>
       <w:r>
@@ -13417,303 +13619,6 @@
           <w:sz w:val="22"/>
           <w:szCs w:val="22"/>
         </w:rPr>
-        <w:t xml:space="preserve">Fig. </w:t>
-      </w:r>
-      <w:r>
-        <w:rPr>
-          <w:rFonts w:ascii="Arial" w:hAnsi="Arial" w:cs="Arial"/>
-          <w:color w:val="000000" w:themeColor="text1"/>
-          <w:sz w:val="22"/>
-          <w:szCs w:val="22"/>
-        </w:rPr>
-        <w:t>8</w:t>
-      </w:r>
-      <w:r>
-        <w:rPr>
-          <w:rFonts w:ascii="Arial" w:hAnsi="Arial" w:cs="Arial"/>
-          <w:color w:val="000000" w:themeColor="text1"/>
-          <w:sz w:val="22"/>
-          <w:szCs w:val="22"/>
-        </w:rPr>
-        <w:t xml:space="preserve">; Appendix D, Supp. Table </w:t>
-      </w:r>
-      <w:r>
-        <w:rPr>
-          <w:rFonts w:ascii="Arial" w:hAnsi="Arial" w:cs="Arial"/>
-          <w:color w:val="000000" w:themeColor="text1"/>
-          <w:sz w:val="22"/>
-          <w:szCs w:val="22"/>
-        </w:rPr>
-        <w:t>4)</w:t>
-      </w:r>
-      <w:r>
-        <w:rPr>
-          <w:rFonts w:ascii="Arial" w:hAnsi="Arial" w:cs="Arial"/>
-          <w:color w:val="000000" w:themeColor="text1"/>
-          <w:sz w:val="22"/>
-          <w:szCs w:val="22"/>
-        </w:rPr>
-        <w:t xml:space="preserve">. </w:t>
-      </w:r>
-      <w:r>
-        <w:rPr>
-          <w:rFonts w:ascii="Arial" w:hAnsi="Arial" w:cs="Arial"/>
-          <w:color w:val="000000" w:themeColor="text1"/>
-          <w:sz w:val="22"/>
-          <w:szCs w:val="22"/>
-        </w:rPr>
-        <w:t>A r</w:t>
-      </w:r>
-      <w:r>
-        <w:rPr>
-          <w:rFonts w:ascii="Arial" w:hAnsi="Arial" w:cs="Arial"/>
-          <w:color w:val="000000" w:themeColor="text1"/>
-          <w:sz w:val="22"/>
-          <w:szCs w:val="22"/>
-        </w:rPr>
-        <w:t>aven</w:t>
-      </w:r>
-      <w:r>
-        <w:rPr>
-          <w:rFonts w:ascii="Arial" w:hAnsi="Arial" w:cs="Arial"/>
-          <w:color w:val="000000" w:themeColor="text1"/>
-          <w:sz w:val="22"/>
-          <w:szCs w:val="22"/>
-        </w:rPr>
-        <w:t>’</w:t>
-      </w:r>
-      <w:r>
-        <w:rPr>
-          <w:rFonts w:ascii="Arial" w:hAnsi="Arial" w:cs="Arial"/>
-          <w:color w:val="000000" w:themeColor="text1"/>
-          <w:sz w:val="22"/>
-          <w:szCs w:val="22"/>
-        </w:rPr>
-        <w:t xml:space="preserve">s </w:t>
-      </w:r>
-      <w:r>
-        <w:rPr>
-          <w:rFonts w:ascii="Arial" w:hAnsi="Arial" w:cs="Arial"/>
-          <w:color w:val="000000" w:themeColor="text1"/>
-          <w:sz w:val="22"/>
-          <w:szCs w:val="22"/>
-        </w:rPr>
-        <w:t>probability of visiting</w:t>
-      </w:r>
-      <w:r>
-        <w:rPr>
-          <w:rFonts w:ascii="Arial" w:hAnsi="Arial" w:cs="Arial"/>
-          <w:color w:val="000000" w:themeColor="text1"/>
-          <w:sz w:val="22"/>
-          <w:szCs w:val="22"/>
-        </w:rPr>
-        <w:t xml:space="preserve"> the hunting regions </w:t>
-      </w:r>
-      <w:r>
-        <w:rPr>
-          <w:rFonts w:ascii="Arial" w:hAnsi="Arial" w:cs="Arial"/>
-          <w:color w:val="000000" w:themeColor="text1"/>
-          <w:sz w:val="22"/>
-          <w:szCs w:val="22"/>
-        </w:rPr>
-        <w:t>increased</w:t>
-      </w:r>
-      <w:r>
-        <w:rPr>
-          <w:rFonts w:ascii="Arial" w:hAnsi="Arial" w:cs="Arial"/>
-          <w:color w:val="000000" w:themeColor="text1"/>
-          <w:sz w:val="22"/>
-          <w:szCs w:val="22"/>
-        </w:rPr>
-        <w:t xml:space="preserve"> by 0.27 (0.23, 0.30) </w:t>
-      </w:r>
-      <w:r>
-        <w:rPr>
-          <w:rFonts w:ascii="Arial" w:hAnsi="Arial" w:cs="Arial"/>
-          <w:color w:val="000000" w:themeColor="text1"/>
-          <w:sz w:val="22"/>
-          <w:szCs w:val="22"/>
-        </w:rPr>
-        <w:t>during the hunting season (</w:t>
-      </w:r>
-      <w:r>
-        <w:rPr>
-          <w:rFonts w:ascii="Arial" w:hAnsi="Arial" w:cs="Arial"/>
-          <w:color w:val="000000" w:themeColor="text1"/>
-          <w:sz w:val="22"/>
-          <w:szCs w:val="22"/>
-        </w:rPr>
-        <w:t xml:space="preserve">OR = </w:t>
-      </w:r>
-      <w:r>
-        <w:rPr>
-          <w:rFonts w:ascii="Arial" w:hAnsi="Arial" w:cs="Arial"/>
-          <w:color w:val="000000" w:themeColor="text1"/>
-          <w:sz w:val="22"/>
-          <w:szCs w:val="22"/>
-        </w:rPr>
-        <w:t>3.4</w:t>
-      </w:r>
-      <w:r>
-        <w:rPr>
-          <w:rFonts w:ascii="Arial" w:hAnsi="Arial" w:cs="Arial"/>
-          <w:color w:val="000000" w:themeColor="text1"/>
-          <w:sz w:val="22"/>
-          <w:szCs w:val="22"/>
-        </w:rPr>
-        <w:t xml:space="preserve"> </w:t>
-      </w:r>
-      <w:r>
-        <w:rPr>
-          <w:rFonts w:ascii="Arial" w:hAnsi="Arial" w:cs="Arial"/>
-          <w:color w:val="000000" w:themeColor="text1"/>
-          <w:sz w:val="22"/>
-          <w:szCs w:val="22"/>
-        </w:rPr>
-        <w:t>[</w:t>
-      </w:r>
-      <w:r>
-        <w:rPr>
-          <w:rFonts w:ascii="Arial" w:hAnsi="Arial" w:cs="Arial"/>
-          <w:color w:val="000000" w:themeColor="text1"/>
-          <w:sz w:val="22"/>
-          <w:szCs w:val="22"/>
-        </w:rPr>
-        <w:t>2.34, 4.95</w:t>
-      </w:r>
-      <w:r>
-        <w:rPr>
-          <w:rFonts w:ascii="Arial" w:hAnsi="Arial" w:cs="Arial"/>
-          <w:color w:val="000000" w:themeColor="text1"/>
-          <w:sz w:val="22"/>
-          <w:szCs w:val="22"/>
-        </w:rPr>
-        <w:t>]</w:t>
-      </w:r>
-      <w:r>
-        <w:rPr>
-          <w:rFonts w:ascii="Arial" w:hAnsi="Arial" w:cs="Arial"/>
-          <w:color w:val="000000" w:themeColor="text1"/>
-          <w:sz w:val="22"/>
-          <w:szCs w:val="22"/>
-        </w:rPr>
-        <w:t>, Fig. 9</w:t>
-      </w:r>
-      <w:r>
-        <w:rPr>
-          <w:rFonts w:ascii="Arial" w:hAnsi="Arial" w:cs="Arial"/>
-          <w:color w:val="000000" w:themeColor="text1"/>
-          <w:sz w:val="22"/>
-          <w:szCs w:val="22"/>
-        </w:rPr>
-        <w:t>) but</w:t>
-      </w:r>
-      <w:r>
-        <w:rPr>
-          <w:rFonts w:ascii="Arial" w:hAnsi="Arial" w:cs="Arial"/>
-          <w:color w:val="000000" w:themeColor="text1"/>
-          <w:sz w:val="22"/>
-          <w:szCs w:val="22"/>
-        </w:rPr>
-        <w:t xml:space="preserve"> were not influenced by the actual amount of biomass available in hunting areas (</w:t>
-      </w:r>
-      <w:r>
-        <w:rPr>
-          <w:rFonts w:ascii="Arial" w:hAnsi="Arial" w:cs="Arial"/>
-          <w:color w:val="000000" w:themeColor="text1"/>
-          <w:sz w:val="22"/>
-          <w:szCs w:val="22"/>
-        </w:rPr>
-        <w:t>p = 0.</w:t>
-      </w:r>
-      <w:r>
-        <w:rPr>
-          <w:rFonts w:ascii="Arial" w:hAnsi="Arial" w:cs="Arial"/>
-          <w:color w:val="000000" w:themeColor="text1"/>
-          <w:sz w:val="22"/>
-          <w:szCs w:val="22"/>
-        </w:rPr>
-        <w:t>13</w:t>
-      </w:r>
-      <w:r>
-        <w:rPr>
-          <w:rFonts w:ascii="Arial" w:hAnsi="Arial" w:cs="Arial"/>
-          <w:color w:val="000000" w:themeColor="text1"/>
-          <w:sz w:val="22"/>
-          <w:szCs w:val="22"/>
-        </w:rPr>
-        <w:t xml:space="preserve">). </w:t>
-      </w:r>
-      <w:r>
-        <w:rPr>
-          <w:rFonts w:ascii="Arial" w:hAnsi="Arial" w:cs="Arial"/>
-          <w:color w:val="000000" w:themeColor="text1"/>
-          <w:sz w:val="22"/>
-          <w:szCs w:val="22"/>
-        </w:rPr>
-        <w:t xml:space="preserve">Ravens </w:t>
-      </w:r>
-      <w:r>
-        <w:rPr>
-          <w:rFonts w:ascii="Arial" w:hAnsi="Arial" w:cs="Arial"/>
-          <w:color w:val="000000" w:themeColor="text1"/>
-          <w:sz w:val="22"/>
-          <w:szCs w:val="22"/>
-        </w:rPr>
-        <w:t xml:space="preserve">reduced the </w:t>
-      </w:r>
-      <w:r>
-        <w:rPr>
-          <w:rFonts w:ascii="Arial" w:hAnsi="Arial" w:cs="Arial"/>
-          <w:color w:val="000000" w:themeColor="text1"/>
-          <w:sz w:val="22"/>
-          <w:szCs w:val="22"/>
-        </w:rPr>
-        <w:t>probability</w:t>
-      </w:r>
-      <w:r>
-        <w:rPr>
-          <w:rFonts w:ascii="Arial" w:hAnsi="Arial" w:cs="Arial"/>
-          <w:color w:val="000000" w:themeColor="text1"/>
-          <w:sz w:val="22"/>
-          <w:szCs w:val="22"/>
-        </w:rPr>
-        <w:t xml:space="preserve"> of visiting the hunting area</w:t>
-      </w:r>
-      <w:r>
-        <w:rPr>
-          <w:rFonts w:ascii="Arial" w:hAnsi="Arial" w:cs="Arial"/>
-          <w:color w:val="000000" w:themeColor="text1"/>
-          <w:sz w:val="22"/>
-          <w:szCs w:val="22"/>
-        </w:rPr>
-        <w:t xml:space="preserve"> by </w:t>
-      </w:r>
-      <w:r>
-        <w:rPr>
-          <w:rFonts w:ascii="Arial" w:hAnsi="Arial" w:cs="Arial"/>
-          <w:color w:val="000000" w:themeColor="text1"/>
-          <w:sz w:val="22"/>
-          <w:szCs w:val="22"/>
-        </w:rPr>
-        <w:t>0.24</w:t>
-      </w:r>
-      <w:r>
-        <w:rPr>
-          <w:rFonts w:ascii="Arial" w:hAnsi="Arial" w:cs="Arial"/>
-          <w:color w:val="000000" w:themeColor="text1"/>
-          <w:sz w:val="22"/>
-          <w:szCs w:val="22"/>
-        </w:rPr>
-        <w:t xml:space="preserve"> (</w:t>
-      </w:r>
-      <w:r>
-        <w:rPr>
-          <w:rFonts w:ascii="Arial" w:hAnsi="Arial" w:cs="Arial"/>
-          <w:color w:val="000000" w:themeColor="text1"/>
-          <w:sz w:val="22"/>
-          <w:szCs w:val="22"/>
-        </w:rPr>
         <w:t>0.21</w:t>
       </w:r>
       <w:r>
@@ -13750,43 +13655,7 @@
           <w:sz w:val="22"/>
           <w:szCs w:val="22"/>
         </w:rPr>
-        <w:t xml:space="preserve"> w</w:t>
-      </w:r>
-      <w:r>
-        <w:rPr>
-          <w:rFonts w:ascii="Arial" w:hAnsi="Arial" w:cs="Arial"/>
-          <w:color w:val="000000" w:themeColor="text1"/>
-          <w:sz w:val="22"/>
-          <w:szCs w:val="22"/>
-        </w:rPr>
-        <w:t xml:space="preserve">hen </w:t>
-      </w:r>
-      <w:r>
-        <w:rPr>
-          <w:rFonts w:ascii="Arial" w:hAnsi="Arial" w:cs="Arial"/>
-          <w:color w:val="000000" w:themeColor="text1"/>
-          <w:sz w:val="22"/>
-          <w:szCs w:val="22"/>
-        </w:rPr>
-        <w:t xml:space="preserve">visiting </w:t>
-      </w:r>
-      <w:r>
-        <w:rPr>
-          <w:rFonts w:ascii="Arial" w:hAnsi="Arial" w:cs="Arial"/>
-          <w:color w:val="000000" w:themeColor="text1"/>
-          <w:sz w:val="22"/>
-          <w:szCs w:val="22"/>
-        </w:rPr>
-        <w:t xml:space="preserve">a wolf kill </w:t>
-      </w:r>
-      <w:r>
-        <w:rPr>
-          <w:rFonts w:ascii="Arial" w:hAnsi="Arial" w:cs="Arial"/>
-          <w:color w:val="000000" w:themeColor="text1"/>
-          <w:sz w:val="22"/>
-          <w:szCs w:val="22"/>
-        </w:rPr>
-        <w:t xml:space="preserve">outside of their territory (OR = 0.33 </w:t>
+        <w:t xml:space="preserve"> when visiting a wolf kill outside of their territory (OR = 0.33 </w:t>
       </w:r>
       <w:r>
         <w:rPr>
@@ -14441,15 +14310,8 @@
     </w:p>
     <w:p>
       <w:pPr>
+        <w:pStyle w:val="Heading2"/>
         <w:spacing w:line="480" w:lineRule="auto"/>
-        <w:rPr>
-          <w:rFonts w:ascii="Arial" w:hAnsi="Arial" w:cs="Arial"/>
-          <w:color w:val="000000" w:themeColor="text1"/>
-          <w:sz w:val="22"/>
-          <w:szCs w:val="22"/>
-        </w:rPr>
-      </w:pPr>
-      <w:r>
         <w:rPr>
           <w:rFonts w:ascii="Arial" w:hAnsi="Arial" w:cs="Arial"/>
           <w:b/>
@@ -14458,8 +14320,7 @@
           <w:sz w:val="22"/>
           <w:szCs w:val="22"/>
         </w:rPr>
-        <w:t xml:space="preserve">3.4 </w:t>
-      </w:r>
+      </w:pPr>
       <w:r>
         <w:rPr>
           <w:rFonts w:ascii="Arial" w:hAnsi="Arial" w:cs="Arial"/>
@@ -14469,16 +14330,18 @@
           <w:sz w:val="22"/>
           <w:szCs w:val="22"/>
         </w:rPr>
-        <w:t>Discussion</w:t>
-      </w:r>
-      <w:r>
-        <w:rPr>
-          <w:rFonts w:ascii="Arial" w:hAnsi="Arial" w:cs="Arial"/>
-          <w:color w:val="000000" w:themeColor="text1"/>
-          <w:sz w:val="22"/>
-          <w:szCs w:val="22"/>
-        </w:rPr>
-        <w:t xml:space="preserve"> </w:t>
+        <w:t xml:space="preserve">3.4 </w:t>
+      </w:r>
+      <w:r>
+        <w:rPr>
+          <w:rFonts w:ascii="Arial" w:hAnsi="Arial" w:cs="Arial"/>
+          <w:b/>
+          <w:bCs/>
+          <w:color w:val="000000" w:themeColor="text1"/>
+          <w:sz w:val="22"/>
+          <w:szCs w:val="22"/>
+        </w:rPr>
+        <w:t xml:space="preserve">Discussion </w:t>
       </w:r>
     </w:p>
     <w:p>
@@ -14831,71 +14694,80 @@
           <w:sz w:val="22"/>
           <w:szCs w:val="22"/>
         </w:rPr>
+        <w:t>foraging efficiency</w:t>
+      </w:r>
+      <w:r>
+        <w:rPr>
+          <w:rFonts w:ascii="Arial" w:hAnsi="Arial" w:cs="Arial"/>
+          <w:color w:val="000000" w:themeColor="text1"/>
+          <w:sz w:val="22"/>
+          <w:szCs w:val="22"/>
+        </w:rPr>
+        <w:t xml:space="preserve"> according to resource availability</w:t>
+      </w:r>
+      <w:r>
+        <w:rPr>
+          <w:rFonts w:ascii="Arial" w:hAnsi="Arial" w:cs="Arial"/>
+          <w:color w:val="000000" w:themeColor="text1"/>
+          <w:sz w:val="22"/>
+          <w:szCs w:val="22"/>
+        </w:rPr>
+        <w:t xml:space="preserve"> </w:t>
+      </w:r>
+      <w:r>
+        <w:rPr>
+          <w:rFonts w:ascii="Arial" w:hAnsi="Arial" w:cs="Arial"/>
+          <w:color w:val="000000" w:themeColor="text1"/>
+          <w:sz w:val="22"/>
+          <w:szCs w:val="22"/>
+        </w:rPr>
+        <w:t>and</w:t>
+      </w:r>
+      <w:r>
+        <w:rPr>
+          <w:rFonts w:ascii="Arial" w:hAnsi="Arial" w:cs="Arial"/>
+          <w:color w:val="000000" w:themeColor="text1"/>
+          <w:sz w:val="22"/>
+          <w:szCs w:val="22"/>
+        </w:rPr>
+        <w:t xml:space="preserve"> </w:t>
+      </w:r>
+      <w:r>
+        <w:rPr>
+          <w:rFonts w:ascii="Arial" w:hAnsi="Arial" w:cs="Arial"/>
+          <w:color w:val="000000" w:themeColor="text1"/>
+          <w:sz w:val="22"/>
+          <w:szCs w:val="22"/>
+        </w:rPr>
+        <w:t>minimizing</w:t>
+      </w:r>
+      <w:r>
+        <w:rPr>
+          <w:rFonts w:ascii="Arial" w:hAnsi="Arial" w:cs="Arial"/>
+          <w:color w:val="000000" w:themeColor="text1"/>
+          <w:sz w:val="22"/>
+          <w:szCs w:val="22"/>
+        </w:rPr>
+        <w:t xml:space="preserve"> investment costs</w:t>
+      </w:r>
+      <w:r>
+        <w:rPr>
+          <w:rFonts w:ascii="Arial" w:hAnsi="Arial" w:cs="Arial"/>
+          <w:color w:val="000000" w:themeColor="text1"/>
+          <w:sz w:val="22"/>
+          <w:szCs w:val="22"/>
+        </w:rPr>
+        <w:t xml:space="preserve"> incurred </w:t>
+      </w:r>
+      <w:r>
+        <w:rPr>
+          <w:rFonts w:ascii="Arial" w:hAnsi="Arial" w:cs="Arial"/>
+          <w:color w:val="000000" w:themeColor="text1"/>
+          <w:sz w:val="22"/>
+          <w:szCs w:val="22"/>
+        </w:rPr>
         <w:lastRenderedPageBreak/>
-        <w:t>foraging efficiency</w:t>
-      </w:r>
-      <w:r>
-        <w:rPr>
-          <w:rFonts w:ascii="Arial" w:hAnsi="Arial" w:cs="Arial"/>
-          <w:color w:val="000000" w:themeColor="text1"/>
-          <w:sz w:val="22"/>
-          <w:szCs w:val="22"/>
-        </w:rPr>
-        <w:t xml:space="preserve"> according to resource availability</w:t>
-      </w:r>
-      <w:r>
-        <w:rPr>
-          <w:rFonts w:ascii="Arial" w:hAnsi="Arial" w:cs="Arial"/>
-          <w:color w:val="000000" w:themeColor="text1"/>
-          <w:sz w:val="22"/>
-          <w:szCs w:val="22"/>
-        </w:rPr>
-        <w:t xml:space="preserve"> </w:t>
-      </w:r>
-      <w:r>
-        <w:rPr>
-          <w:rFonts w:ascii="Arial" w:hAnsi="Arial" w:cs="Arial"/>
-          <w:color w:val="000000" w:themeColor="text1"/>
-          <w:sz w:val="22"/>
-          <w:szCs w:val="22"/>
-        </w:rPr>
-        <w:t>and</w:t>
-      </w:r>
-      <w:r>
-        <w:rPr>
-          <w:rFonts w:ascii="Arial" w:hAnsi="Arial" w:cs="Arial"/>
-          <w:color w:val="000000" w:themeColor="text1"/>
-          <w:sz w:val="22"/>
-          <w:szCs w:val="22"/>
-        </w:rPr>
-        <w:t xml:space="preserve"> </w:t>
-      </w:r>
-      <w:r>
-        <w:rPr>
-          <w:rFonts w:ascii="Arial" w:hAnsi="Arial" w:cs="Arial"/>
-          <w:color w:val="000000" w:themeColor="text1"/>
-          <w:sz w:val="22"/>
-          <w:szCs w:val="22"/>
-        </w:rPr>
-        <w:t>minimizing</w:t>
-      </w:r>
-      <w:r>
-        <w:rPr>
-          <w:rFonts w:ascii="Arial" w:hAnsi="Arial" w:cs="Arial"/>
-          <w:color w:val="000000" w:themeColor="text1"/>
-          <w:sz w:val="22"/>
-          <w:szCs w:val="22"/>
-        </w:rPr>
-        <w:t xml:space="preserve"> investment costs</w:t>
-      </w:r>
-      <w:r>
-        <w:rPr>
-          <w:rFonts w:ascii="Arial" w:hAnsi="Arial" w:cs="Arial"/>
-          <w:color w:val="000000" w:themeColor="text1"/>
-          <w:sz w:val="22"/>
-          <w:szCs w:val="22"/>
-        </w:rPr>
-        <w:t xml:space="preserve"> incurred by travel</w:t>
+        <w:t>by travel</w:t>
       </w:r>
       <w:r>
         <w:rPr>
@@ -15334,8 +15206,10 @@
       </w:r>
       <w:r>
         <w:rPr>
-          <w:rFonts w:ascii="Aptos" w:hAnsi="Aptos"/>
-          <w:sz w:val="22"/>
+          <w:rFonts w:ascii="Arial" w:hAnsi="Arial" w:cs="Arial"/>
+          <w:color w:val="000000" w:themeColor="text1"/>
+          <w:sz w:val="22"/>
+          <w:szCs w:val="22"/>
         </w:rPr>
         <w:t>(McNaughton 1990, Deacy et al. 2016, Middleton et al. 2018)</w:t>
       </w:r>
@@ -15859,7 +15733,25 @@
           <w:sz w:val="22"/>
           <w:szCs w:val="22"/>
         </w:rPr>
-        <w:t xml:space="preserve"> </w:t>
+        <w:t xml:space="preserve"> harder to detect and provide less biomass to scavengers as a wolf pack is </w:t>
+      </w:r>
+      <w:r>
+        <w:rPr>
+          <w:rFonts w:ascii="Arial" w:hAnsi="Arial" w:cs="Arial"/>
+          <w:color w:val="000000" w:themeColor="text1"/>
+          <w:sz w:val="22"/>
+          <w:szCs w:val="22"/>
+        </w:rPr>
+        <w:t xml:space="preserve">often </w:t>
+      </w:r>
+      <w:r>
+        <w:rPr>
+          <w:rFonts w:ascii="Arial" w:hAnsi="Arial" w:cs="Arial"/>
+          <w:color w:val="000000" w:themeColor="text1"/>
+          <w:sz w:val="22"/>
+          <w:szCs w:val="22"/>
+        </w:rPr>
+        <w:t xml:space="preserve">able to remove </w:t>
       </w:r>
       <w:r>
         <w:rPr>
@@ -15869,25 +15761,7 @@
           <w:szCs w:val="22"/>
         </w:rPr>
         <w:lastRenderedPageBreak/>
-        <w:t xml:space="preserve">harder to detect and provide less biomass to scavengers as a wolf pack is </w:t>
-      </w:r>
-      <w:r>
-        <w:rPr>
-          <w:rFonts w:ascii="Arial" w:hAnsi="Arial" w:cs="Arial"/>
-          <w:color w:val="000000" w:themeColor="text1"/>
-          <w:sz w:val="22"/>
-          <w:szCs w:val="22"/>
-        </w:rPr>
-        <w:t xml:space="preserve">often </w:t>
-      </w:r>
-      <w:r>
-        <w:rPr>
-          <w:rFonts w:ascii="Arial" w:hAnsi="Arial" w:cs="Arial"/>
-          <w:color w:val="000000" w:themeColor="text1"/>
-          <w:sz w:val="22"/>
-          <w:szCs w:val="22"/>
-        </w:rPr>
-        <w:t xml:space="preserve">able to remove all of the biomass during their initial feeding bout </w:t>
+        <w:t xml:space="preserve">all of the biomass during their initial feeding bout </w:t>
       </w:r>
       <w:r>
         <w:rPr>
@@ -16323,7 +16197,7 @@
           <w:sz w:val="22"/>
           <w:szCs w:val="22"/>
         </w:rPr>
-        <w:t xml:space="preserve">OPT is generally considered for a single organism, but has been expanded to consider </w:t>
+        <w:t xml:space="preserve">OPT is generally considered for a single organism, but has been expanded to consider competition and information sharing between foragers for resources into a game-theory style </w:t>
       </w:r>
       <w:r>
         <w:rPr>
@@ -16333,7 +16207,7 @@
           <w:szCs w:val="22"/>
         </w:rPr>
         <w:lastRenderedPageBreak/>
-        <w:t xml:space="preserve">competition and information sharing between foragers for resources into a game-theory style problem for social foraging </w:t>
+        <w:t xml:space="preserve">problem for social foraging </w:t>
       </w:r>
       <w:r>
         <w:rPr>
@@ -17605,7 +17479,25 @@
           <w:sz w:val="22"/>
           <w:szCs w:val="22"/>
         </w:rPr>
-        <w:t xml:space="preserve">. Conversely, 7485 resided in Old Faithful (Fig. 3) which is one of the highest traffic human areas during the summer and continues to have residents and tourism throughout the winter. However, 7485 often chose to abandon her territory. Old Faithful supports multiple breeding </w:t>
+        <w:t>. Conversely, 7485 resided in Old Faithful (Fig. 3) which is one of the highest traffic human areas during the summer and continues to have residents and tourism throughout the winter. However, 7485 often chose to abandon her territory. Old Faithful supports multiple breeding territories</w:t>
+      </w:r>
+      <w:r>
+        <w:rPr>
+          <w:rFonts w:ascii="Arial" w:hAnsi="Arial" w:cs="Arial"/>
+          <w:color w:val="000000" w:themeColor="text1"/>
+          <w:sz w:val="22"/>
+          <w:szCs w:val="22"/>
+        </w:rPr>
+        <w:t>, including 7494</w:t>
+      </w:r>
+      <w:r>
+        <w:rPr>
+          <w:rFonts w:ascii="Arial" w:hAnsi="Arial" w:cs="Arial"/>
+          <w:color w:val="000000" w:themeColor="text1"/>
+          <w:sz w:val="22"/>
+          <w:szCs w:val="22"/>
+        </w:rPr>
+        <w:t xml:space="preserve">, which create more competition for resources than 7493_2 likely </w:t>
       </w:r>
       <w:r>
         <w:rPr>
@@ -17615,25 +17507,7 @@
           <w:szCs w:val="22"/>
         </w:rPr>
         <w:lastRenderedPageBreak/>
-        <w:t>territories</w:t>
-      </w:r>
-      <w:r>
-        <w:rPr>
-          <w:rFonts w:ascii="Arial" w:hAnsi="Arial" w:cs="Arial"/>
-          <w:color w:val="000000" w:themeColor="text1"/>
-          <w:sz w:val="22"/>
-          <w:szCs w:val="22"/>
-        </w:rPr>
-        <w:t>, including 7494</w:t>
-      </w:r>
-      <w:r>
-        <w:rPr>
-          <w:rFonts w:ascii="Arial" w:hAnsi="Arial" w:cs="Arial"/>
-          <w:color w:val="000000" w:themeColor="text1"/>
-          <w:sz w:val="22"/>
-          <w:szCs w:val="22"/>
-        </w:rPr>
-        <w:t>, which create more competition for resources than 7493_2 likely faces</w:t>
+        <w:t>faces</w:t>
       </w:r>
       <w:r>
         <w:rPr>
@@ -18212,7 +18086,7 @@
           <w:sz w:val="22"/>
           <w:szCs w:val="22"/>
         </w:rPr>
-        <w:t xml:space="preserve">. While wolf density, and therefore kill availability, are relatively dense in Yellowstone compared to other ecosystems, very few ravens had wolf kills available to them within their territories. Only 6 individuals visited kills available to them, resulting in large uncertainty in the model. The GPS data loggers presented another limitation. The fix-rate likely missed visits to wolf kills, especially if the individual did not </w:t>
+        <w:t xml:space="preserve">. While wolf density, and therefore kill availability, are relatively dense in Yellowstone compared to other ecosystems, very few ravens had wolf kills available to them within their territories. Only 6 individuals visited kills available to them, resulting in large uncertainty in the model. The GPS data loggers presented another limitation. The fix-rate likely missed visits to wolf kills, especially if the individual did not spend extended periods of time interacting with the resource. This results in a slightly messy </w:t>
       </w:r>
       <w:r>
         <w:rPr>
@@ -18222,7 +18096,7 @@
           <w:szCs w:val="22"/>
         </w:rPr>
         <w:lastRenderedPageBreak/>
-        <w:t xml:space="preserve">spend extended periods of time interacting with the resource. This results in a slightly messy interpretation of the wolf kill availability covariate, where it is not clear on which days a raven has knowledge that a wolf kill is within its territory if a GPS point is never recorded at the site. Despite this, when ravens visit a wolf kill, indicating knowledge of the site, there was a clear negative effect. </w:t>
+        <w:t xml:space="preserve">interpretation of the wolf kill availability covariate, where it is not clear on which days a raven has knowledge that a wolf kill is within its territory if a GPS point is never recorded at the site. Despite this, when ravens visit a wolf kill, indicating knowledge of the site, there was a clear negative effect. </w:t>
       </w:r>
     </w:p>
     <w:p>

</xml_diff>